<commit_message>
feat: add standard treatment as baseline argument + athlete treatment stress
Per user feedback: 'TUEがあるというのではなくて、ベースで標準治療が受けられるべき'

- Discussion (EN+JP): new paragraph arguing standard clinical treatment should be
  the default entitlement, not prohibited-by-default with TUE exceptions
- Highlights limited access to sports medicine physicians knowledgeable in both
  anti-doping and pharmacotherapy
- Documents treatment stress (regulatory uncertainty, admin burden, psychological
  distress) as under-recognized harm to athletes
- Response letter (EN+JP): added concluding paragraph reinforcing this position
- Word count: 6,578 (within SCJ 5,000-8,000 range)

Co-Authored-By: Tatsuki Onishi <bougtoir@gmail.com>
</commit_message>
<xml_diff>
--- a/wada-tue-scoping-review/manuscripts/BJSM_Response_Letter_English.docx
+++ b/wada-tue-scoping-review/manuscripts/BJSM_Response_Letter_English.docx
@@ -585,6 +585,19 @@
           <w:i w:val="0"/>
           <w:sz w:val="22"/>
         </w:rPr>
+        <w:t>We wish to emphasize a fundamental point: the existence of a TUE pathway does not, in itself, ensure equitable access to evidence-based medical care. The current system places the burden on athletes to navigate complex regulations, secure specialist documentation, and petition for exceptions to receive standard treatment. Few athletes have access to sports medicine physicians with expertise in both anti-doping regulations and their specific condition; most are treated by general practitioners or specialists unfamiliar with WADA rules. We argue that standard clinical treatment should be the baseline entitlement for all athletes, with restrictions applied only where a substance confers a clear performance advantage beyond therapeutic restoration. The treatment stress imposed on athletes—regulatory uncertainty, administrative burden, and psychological distress from navigating these systems—is itself a significant and under-recognized harm that our review aims to bring to wider attention.</w:t>
+      </w:r>
+    </w:p>
+    <w:p>
+      <w:pPr>
+        <w:spacing w:before="0" w:after="80"/>
+      </w:pPr>
+      <w:r>
+        <w:rPr>
+          <w:b w:val="0"/>
+          <w:i w:val="0"/>
+          <w:sz w:val="22"/>
+        </w:rPr>
         <w:t>We will proceed with submission to the Strength and Conditioning Journal, where the full scoping review format (5,000–8,000 words) allows for the comprehensive treatment that both reviewers’ comments suggest is needed. The SCJ manuscript incorporates the valid points raised by both reviewers, including expanded salbutamol analysis, more nuanced GLP-1 discussion, acknowledgment of recent TUE guideline updates, and—critically—a new section on jurisdictional variability in TUE access based on the author’s first-hand experience.</w:t>
       </w:r>
     </w:p>

</xml_diff>